<commit_message>
Eduardo Costa: revisão da Parte 4
Co-Authored-By: Claude Opus 5.5 <noreply@anthropic.com>
Claude-Session: https://claude.ai/code/session_01MJjUEEZrxQDEUifKK2vj9g
</commit_message>
<xml_diff>
--- a/roteiros/eduardo-costa/EduardoCosta_Parte4.docx
+++ b/roteiros/eduardo-costa/EduardoCosta_Parte4.docx
@@ -87,7 +87,7 @@
         <w:rPr>
           <w:color w:val="C00000"/>
         </w:rPr>
-        <w:t>Guarde essa noite. Porque o que Eduardo fez logo depois ia virar um processo, uma condenação e, sete anos depois, um pedido de prisão. E tudo começou diante de uma tela de celular.</w:t>
+        <w:t>Guarde essa noite. Porque o que Eduardo fez logo depois ia virar um processo, uma condenação e, mais de seis anos depois, um pedido de prisão. E tudo começou diante de uma tela de celular.</w:t>
       </w:r>
     </w:p>
     <w:p>
@@ -183,7 +183,7 @@
         <w:rPr>
           <w:color w:val="C00000"/>
         </w:rPr>
-        <w:t>Pense no que estava acontecendo na vida dele naquele momento. A ex-noiva que tinha acusado ele de vazar fotos íntimas agora era a noiva dele de novo. A comparação com a lagosta ainda estava fresca. E agora o país inteiro discutia o ataque a uma das apresentadoras mais famosas da Globo.</w:t>
+        <w:t>Pense no que estava acontecendo na vida dele naquele momento. A mulher que tinha acusado ele de vazar fotos íntimas agora era a noiva dele. A comparação com a lagosta ainda estava fresca. E agora o país inteiro discutia o ataque a uma das apresentadoras mais famosas da Globo.</w:t>
       </w:r>
     </w:p>
     <w:p>
@@ -311,7 +311,7 @@
         <w:rPr>
           <w:color w:val="000000"/>
         </w:rPr>
-        <w:t>Em março de dois mil e vinte, o mundo parou. A pandemia fechou casas de show, cancelou turnês, deixou os artistas presos dentro de casa.</w:t>
+        <w:t>Em março de dois mil e vinte, o mundo parou. A pandemia fechou as casas de show e deixou os artistas presos dentro de casa.</w:t>
       </w:r>
     </w:p>
     <w:p>
@@ -359,7 +359,7 @@
         <w:rPr>
           <w:color w:val="000000"/>
         </w:rPr>
-        <w:t>Durante a transmissão, segundo relatos publicados depois, Eduardo bebeu, fez piadas machistas e comentários de cunho sexual que constrangeram quem estava assistindo. Num dos momentos que mais repercutiram, Leonardo chegou a tapar a boca do amigo com a mão, para impedir que ele continuasse falando.</w:t>
+        <w:t>Durante a transmissão, segundo relatos publicados depois, Eduardo bebia enquanto fazia piadas machistas, com comentários de cunho sexual que constrangeram quem estava assistindo. Num dos momentos que mais repercutiram, Leonardo chegou a tapar a boca do amigo com a mão, para impedir que ele continuasse falando.</w:t>
       </w:r>
     </w:p>
     <w:p>

</xml_diff>